<commit_message>
feat: Update document completeness and revision progress logic with new conditions and tests
feat: Update document completeness and revision progress logic with new conditions and tests
</commit_message>
<xml_diff>
--- a/HRCP-KKU-Academic/src/main/resources/templates/docx/Phase2/p2doc_6.docx
+++ b/HRCP-KKU-Academic/src/main/resources/templates/docx/Phase2/p2doc_6.docx
@@ -2270,6 +2270,8 @@
     </w:p>
     <w:p>
       <w:pPr>
+        <w:ind w:left="2160"/>
+        <w:jc w:val="center"/>
         <w:rPr>
           <w:rFonts w:ascii="TH Sarabun New" w:hAnsi="TH Sarabun New" w:cs="TH Sarabun New"/>
           <w:color w:val="000000" w:themeColor="text1"/>
@@ -2277,76 +2279,6 @@
           <w:szCs w:val="32"/>
         </w:rPr>
       </w:pPr>
-      <w:r>
-        <w:rPr>
-          <w:rFonts w:ascii="TH Sarabun New" w:hAnsi="TH Sarabun New" w:cs="TH Sarabun New"/>
-          <w:color w:val="000000" w:themeColor="text1"/>
-          <w:sz w:val="32"/>
-          <w:szCs w:val="32"/>
-          <w:cs/>
-        </w:rPr>
-        <w:t xml:space="preserve"> </w:t>
-      </w:r>
-      <w:r>
-        <w:rPr>
-          <w:rFonts w:ascii="TH Sarabun New" w:hAnsi="TH Sarabun New" w:cs="TH Sarabun New"/>
-          <w:color w:val="000000" w:themeColor="text1"/>
-          <w:sz w:val="32"/>
-          <w:szCs w:val="32"/>
-          <w:cs/>
-        </w:rPr>
-        <w:tab/>
-      </w:r>
-      <w:r>
-        <w:rPr>
-          <w:rFonts w:ascii="TH Sarabun New" w:hAnsi="TH Sarabun New" w:cs="TH Sarabun New"/>
-          <w:color w:val="000000" w:themeColor="text1"/>
-          <w:sz w:val="32"/>
-          <w:szCs w:val="32"/>
-          <w:cs/>
-        </w:rPr>
-        <w:tab/>
-      </w:r>
-      <w:r>
-        <w:rPr>
-          <w:rFonts w:ascii="TH Sarabun New" w:hAnsi="TH Sarabun New" w:cs="TH Sarabun New"/>
-          <w:color w:val="000000" w:themeColor="text1"/>
-          <w:sz w:val="32"/>
-          <w:szCs w:val="32"/>
-          <w:cs/>
-        </w:rPr>
-        <w:tab/>
-      </w:r>
-      <w:r>
-        <w:rPr>
-          <w:rFonts w:ascii="TH Sarabun New" w:hAnsi="TH Sarabun New" w:cs="TH Sarabun New"/>
-          <w:color w:val="000000" w:themeColor="text1"/>
-          <w:sz w:val="32"/>
-          <w:szCs w:val="32"/>
-          <w:cs/>
-        </w:rPr>
-        <w:tab/>
-      </w:r>
-      <w:r>
-        <w:rPr>
-          <w:rFonts w:ascii="TH Sarabun New" w:hAnsi="TH Sarabun New" w:cs="TH Sarabun New"/>
-          <w:color w:val="000000" w:themeColor="text1"/>
-          <w:sz w:val="32"/>
-          <w:szCs w:val="32"/>
-        </w:rPr>
-        <w:tab/>
-        <w:t xml:space="preserve">         </w:t>
-      </w:r>
-      <w:r>
-        <w:rPr>
-          <w:rFonts w:ascii="TH Sarabun New" w:hAnsi="TH Sarabun New" w:cs="TH Sarabun New"/>
-          <w:color w:val="000000" w:themeColor="text1"/>
-          <w:sz w:val="32"/>
-          <w:szCs w:val="32"/>
-          <w:cs/>
-        </w:rPr>
-        <w:t xml:space="preserve"> </w:t>
-      </w:r>
       <w:r>
         <w:rPr>
           <w:rFonts w:ascii="TH Sarabun New" w:hAnsi="TH Sarabun New" w:cs="TH Sarabun New"/>
@@ -2377,7 +2309,8 @@
     </w:p>
     <w:p>
       <w:pPr>
-        <w:ind w:left="3600" w:firstLine="720"/>
+        <w:ind w:left="2160"/>
+        <w:jc w:val="center"/>
         <w:rPr>
           <w:rFonts w:ascii="TH Sarabun New" w:hAnsi="TH Sarabun New" w:cs="TH Sarabun New"/>
           <w:sz w:val="32"/>
@@ -2391,7 +2324,7 @@
           <w:szCs w:val="32"/>
           <w:cs/>
         </w:rPr>
-        <w:t xml:space="preserve"> ผู้ขอกำหนดตำแหน่งทางวิชาการ</w:t>
+        <w:t>ผู้ขอกำหนดตำแหน่งทางวิชาการ</w:t>
       </w:r>
     </w:p>
     <w:p>
@@ -2475,16 +2408,6 @@
           <w:szCs w:val="32"/>
         </w:rPr>
       </w:pPr>
-      <w:r>
-        <w:rPr>
-          <w:rFonts w:ascii="TH Sarabun New" w:hAnsi="TH Sarabun New" w:cs="TH Sarabun New"/>
-          <w:color w:val="000000" w:themeColor="text1"/>
-          <w:sz w:val="32"/>
-          <w:szCs w:val="32"/>
-          <w:cs/>
-        </w:rPr>
-        <w:t xml:space="preserve">    </w:t>
-      </w:r>
       <w:bookmarkStart w:id="0" w:name="_Hlk44345511"/>
       <w:r>
         <w:rPr>

</xml_diff>